<commit_message>
Add QCE2026 paper to CVs
</commit_message>
<xml_diff>
--- a/cv/CV_ENGLISH.docx
+++ b/cv/CV_ENGLISH.docx
@@ -401,6 +401,12 @@
         <w:t>Spanish (native), English (advanced, C1) | Class B driving license. Willingness to travel.</w:t>
       </w:r>
     </w:p>
+    <w:p>
+      <w:pPr/>
+      <w:r>
+        <w:t>Peer-reviewed paper based on Entangle accepted for publication at QCE2026.</w:t>
+      </w:r>
+    </w:p>
     <w:sectPr>
       <w:pgSz w:w="12240" w:h="15840"/>
       <w:pgMar w:top="792" w:right="936" w:bottom="792" w:left="936" w:header="720" w:footer="720" w:gutter="0"/>

</xml_diff>